<commit_message>
Atualiza narrativa freelance e Performance Lab
</commit_message>
<xml_diff>
--- a/curriculo/CV_Guilherme_Crepaldi_Integracoes_Sistemas_PTBR_Atualizado_20261008.docx
+++ b/curriculo/CV_Guilherme_Crepaldi_Integracoes_Sistemas_PTBR_Atualizado_20261008.docx
@@ -109,7 +109,7 @@
           <w:color w:val="18212B"/>
           <w:sz w:val="18"/>
         </w:rPr>
-        <w:t>Desenvolvedor de sistemas com foco em integrações, APIs REST e backend. Em projetos próprios e experiências freelance, construo serviços com Python/FastAPI e C#/.NET, bancos SQL e PostgreSQL, Docker, testes automatizados e práticas de observabilidade. Trago também experiência anterior em operações B2B, levantamento de necessidades e organização de fluxos. Busco contribuir na evolução e sustentação de integrações de forma técnica, analítica e colaborativa.</w:t>
+        <w:t>Desenvolvedor de sistemas com foco em integrações, APIs REST e backend. Atuo de forma contínua como freelancer em desenvolvimento web, automação e projetos de sistemas; em projetos próprios, uso Python/FastAPI e C#/.NET, bancos SQL e PostgreSQL, Docker e testes automatizados. Trago também experiência em operações B2B e busco oportunidade CLT para aplicar esse repertório de forma técnica, analítica e colaborativa.</w:t>
       </w:r>
     </w:p>
     <w:p>
@@ -666,7 +666,7 @@
                 <w:color w:val="102A43"/>
                 <w:sz w:val="20"/>
               </w:rPr>
-              <w:t>Web Designer e Desenvolvedor PHP (Freelance)</w:t>
+              <w:t>Desenvolvedor Web Freelancer</w:t>
             </w:r>
             <w:r>
               <w:rPr>
@@ -676,7 +676,7 @@
                 <w:color w:val="52616B"/>
                 <w:sz w:val="18"/>
               </w:rPr>
-              <w:t xml:space="preserve">  |  Insight Trade</w:t>
+              <w:t xml:space="preserve">  |  Clientes diversos</w:t>
             </w:r>
           </w:p>
         </w:tc>
@@ -709,7 +709,7 @@
                 <w:color w:val="52616B"/>
                 <w:sz w:val="17"/>
               </w:rPr>
-              <w:t>2019 - dez. 2021</w:t>
+              <w:t>2019 - atual</w:t>
             </w:r>
           </w:p>
         </w:tc>
@@ -738,7 +738,7 @@
           <w:color w:val="18212B"/>
           <w:sz w:val="18"/>
         </w:rPr>
-        <w:t>Atuação freelance em web design e desenvolvimento de soluções web em PHP para projetos da agência.</w:t>
+        <w:t>Desenvolvimento e manutenção de sites e soluções web em PHP para clientes.</w:t>
       </w:r>
     </w:p>
     <w:p>
@@ -764,7 +764,174 @@
           <w:color w:val="18212B"/>
           <w:sz w:val="18"/>
         </w:rPr>
-        <w:t>Atuação com CRMs e implementação de marketplace em projetos digitais.</w:t>
+        <w:t>Projetos com CRMs e marketplaces.</w:t>
+      </w:r>
+    </w:p>
+    <w:p>
+      <w:pPr>
+        <w:spacing w:after="44" w:line="250" w:lineRule="auto"/>
+        <w:ind w:left="215" w:hanging="153"/>
+      </w:pPr>
+      <w:r>
+        <w:rPr>
+          <w:rFonts w:ascii="Liberation Sans" w:hAnsi="Liberation Sans"/>
+          <w:b/>
+          <w:i w:val="0"/>
+          <w:color w:val="137C8B"/>
+          <w:sz w:val="18"/>
+        </w:rPr>
+        <w:t xml:space="preserve">• </w:t>
+      </w:r>
+      <w:r>
+        <w:rPr>
+          <w:rFonts w:ascii="Liberation Sans" w:hAnsi="Liberation Sans"/>
+          <w:b w:val="0"/>
+          <w:i w:val="0"/>
+          <w:color w:val="18212B"/>
+          <w:sz w:val="18"/>
+        </w:rPr>
+        <w:t>Cliente em destaque: atuação como freelancer de web design e desenvolvimento PHP para a Insight Trade Comunicação e Marketing, entre 2019 e dez. 2021.</w:t>
+      </w:r>
+    </w:p>
+    <w:tbl>
+      <w:tblPr>
+        <w:tblW w:type="auto" w:w="0"/>
+        <w:jc w:val="left"/>
+        <w:tblLayout w:type="fixed"/>
+        <w:tblLook w:firstColumn="1" w:firstRow="1" w:lastColumn="0" w:lastRow="0" w:noHBand="0" w:noVBand="1" w:val="04A0"/>
+      </w:tblPr>
+      <w:tblGrid>
+        <w:gridCol w:w="7313"/>
+        <w:gridCol w:w="2381"/>
+      </w:tblGrid>
+      <w:tr>
+        <w:tc>
+          <w:tcPr>
+            <w:tcW w:type="dxa" w:w="5355"/>
+            <w:tcMar>
+              <w:top w:w="0" w:type="dxa"/>
+              <w:start w:w="0" w:type="dxa"/>
+              <w:bottom w:w="0" w:type="dxa"/>
+              <w:end w:w="0" w:type="dxa"/>
+            </w:tcMar>
+            <w:tcBorders>
+              <w:top w:val="nil"/>
+              <w:bottom w:val="nil"/>
+              <w:start w:val="nil"/>
+              <w:end w:val="nil"/>
+            </w:tcBorders>
+          </w:tcPr>
+          <w:p>
+            <w:pPr>
+              <w:spacing w:before="0" w:after="20" w:line="240" w:lineRule="auto"/>
+            </w:pPr>
+            <w:r>
+              <w:rPr>
+                <w:rFonts w:ascii="Liberation Sans" w:hAnsi="Liberation Sans"/>
+                <w:b/>
+                <w:i w:val="0"/>
+                <w:color w:val="102A43"/>
+                <w:sz w:val="20"/>
+              </w:rPr>
+              <w:t>Desenvolvedor de Software e Automação</w:t>
+            </w:r>
+            <w:r>
+              <w:rPr>
+                <w:rFonts w:ascii="Liberation Sans" w:hAnsi="Liberation Sans"/>
+                <w:b w:val="0"/>
+                <w:i w:val="0"/>
+                <w:color w:val="52616B"/>
+                <w:sz w:val="18"/>
+              </w:rPr>
+              <w:t xml:space="preserve">  |  Performance Lab - prestação de serviços</w:t>
+            </w:r>
+          </w:p>
+        </w:tc>
+        <w:tc>
+          <w:tcPr>
+            <w:tcW w:type="dxa" w:w="5355"/>
+            <w:tcMar>
+              <w:top w:w="0" w:type="dxa"/>
+              <w:start w:w="0" w:type="dxa"/>
+              <w:bottom w:w="0" w:type="dxa"/>
+              <w:end w:w="0" w:type="dxa"/>
+            </w:tcMar>
+            <w:tcBorders>
+              <w:top w:val="nil"/>
+              <w:bottom w:val="nil"/>
+              <w:start w:val="nil"/>
+              <w:end w:val="nil"/>
+            </w:tcBorders>
+          </w:tcPr>
+          <w:p>
+            <w:pPr>
+              <w:spacing w:before="0" w:after="20" w:line="240" w:lineRule="auto"/>
+              <w:jc w:val="right"/>
+            </w:pPr>
+            <w:r>
+              <w:rPr>
+                <w:rFonts w:ascii="Liberation Sans" w:hAnsi="Liberation Sans"/>
+                <w:b/>
+                <w:i w:val="0"/>
+                <w:color w:val="52616B"/>
+                <w:sz w:val="17"/>
+              </w:rPr>
+              <w:t>dez. 2025 - out. 2026</w:t>
+            </w:r>
+          </w:p>
+        </w:tc>
+      </w:tr>
+    </w:tbl>
+    <w:p>
+      <w:pPr>
+        <w:spacing w:after="44" w:line="250" w:lineRule="auto"/>
+        <w:ind w:left="215" w:hanging="153"/>
+      </w:pPr>
+      <w:r>
+        <w:rPr>
+          <w:rFonts w:ascii="Liberation Sans" w:hAnsi="Liberation Sans"/>
+          <w:b/>
+          <w:i w:val="0"/>
+          <w:color w:val="137C8B"/>
+          <w:sz w:val="18"/>
+        </w:rPr>
+        <w:t xml:space="preserve">• </w:t>
+      </w:r>
+      <w:r>
+        <w:rPr>
+          <w:rFonts w:ascii="Liberation Sans" w:hAnsi="Liberation Sans"/>
+          <w:b w:val="0"/>
+          <w:i w:val="0"/>
+          <w:color w:val="18212B"/>
+          <w:sz w:val="18"/>
+        </w:rPr>
+        <w:t>Desenvolvimento de soluções full stack, integrações e automações para projetos de clientes, incluindo automação industrial com sensores para revisão de tecidos.</w:t>
+      </w:r>
+    </w:p>
+    <w:p>
+      <w:pPr>
+        <w:spacing w:after="44" w:line="250" w:lineRule="auto"/>
+        <w:ind w:left="215" w:hanging="153"/>
+      </w:pPr>
+      <w:r>
+        <w:rPr>
+          <w:rFonts w:ascii="Liberation Sans" w:hAnsi="Liberation Sans"/>
+          <w:b/>
+          <w:i w:val="0"/>
+          <w:color w:val="137C8B"/>
+          <w:sz w:val="18"/>
+        </w:rPr>
+        <w:t xml:space="preserve">• </w:t>
+      </w:r>
+      <w:r>
+        <w:rPr>
+          <w:rFonts w:ascii="Liberation Sans" w:hAnsi="Liberation Sans"/>
+          <w:b w:val="0"/>
+          <w:i w:val="0"/>
+          <w:color w:val="18212B"/>
+          <w:sz w:val="18"/>
+        </w:rPr>
+        <w:t>Desenvolvimento web em PHP e frontend, web scraping e pesquisa de dados na internet.</w:t>
       </w:r>
     </w:p>
     <w:tbl>
@@ -1046,7 +1213,7 @@
           <w:color w:val="52616B"/>
           <w:sz w:val="17"/>
         </w:rPr>
-        <w:t>Disponibilidade: remoto, híbrido, presencial e mudança de cidade.</w:t>
+        <w:t>Disponibilidade imediata para CLT, remoto, híbrido, presencial e mudança de cidade.</w:t>
       </w:r>
     </w:p>
     <w:sectPr>

</xml_diff>